<commit_message>
docs: apply DUZELT 1 corrections to management brief
Scope proof and infeasibility wording to generated routes, qualify Pareto
and borrowing assumptions, and record owner minibus count in X02.
Regenerate the Word version from the corrected Markdown.

Co-Authored-By: Claude Opus 5.5 <noreply@anthropic.com>
</commit_message>
<xml_diff>
--- a/docs/paper/results/week-2026-10-05-fleet/YONETIM_OZETI.docx
+++ b/docs/paper/results/week-2026-10-05-fleet/YONETIM_OZETI.docx
@@ -83,7 +83,7 @@
         <w:pStyle w:val="ListBullet"/>
       </w:pPr>
       <w:r>
-        <w:t>Rotaları bir bilgisayar yöntemi üretti (sezgisel yöntem: bilgisayarın ürettiği yaklaşık rotalar). "En az araç" yalnızca üretilen rotalar arasında kanıtlanmıştır; farklı bir rota planı daha az araçla çalışabilir.</w:t>
+        <w:t>Rotaları bir bilgisayar yöntemi üretti (sezgisel yöntem: bilgisayarın ürettiği yaklaşık rotalar). Senaryo A'daki minibüs sayısı yalnızca bilgisayarın ürettiği tek bir rota planı için kanıtlanmıştır; farklı bir rota planı daha az minibüsle çalışabilir. B, C ve D'deki sedan sayısı ise yalnızca bilgisayarın ürettiği rota seçenekleri arasındaki en az sayıdır; bütün olası rotalar arasında en az olduğu kanıtlanmış değildir.</w:t>
       </w:r>
     </w:p>
     <w:p>
@@ -106,7 +106,7 @@
         <w:t>B</w:t>
       </w:r>
       <w:r>
-        <w:t xml:space="preserve"> mevcut 1 minibüs + ödünç sedanlar. </w:t>
+        <w:t xml:space="preserve"> mevcut 1 minibüs (sahip beyanı, karar kaydı X02) + ödünç sedanlar. </w:t>
       </w:r>
       <w:r>
         <w:rPr>
@@ -261,7 +261,7 @@
               <w:rPr>
                 <w:sz w:val="19"/>
               </w:rPr>
-              <w:t>Yapılamıyor (5 günün hiçbirinde)</w:t>
+              <w:t>Yapılamıyor (*) (5 günün hiçbirinde)</w:t>
             </w:r>
           </w:p>
         </w:tc>
@@ -302,7 +302,7 @@
               <w:rPr>
                 <w:sz w:val="19"/>
               </w:rPr>
-              <w:t>Yapılamıyor: yalnızca Salı, Perşembe, Cuma mümkün</w:t>
+              <w:t>Yapılamıyor (*): yalnızca Salı, Perşembe, Cuma mümkün</w:t>
             </w:r>
           </w:p>
         </w:tc>
@@ -363,6 +363,11 @@
       </w:tr>
     </w:tbl>
     <w:p/>
+    <w:p>
+      <w:r>
+        <w:t>(*) 'Yapılamıyor': bilgisayarın ürettiği rota seçenekleri içinde bu filo ile çözüm bulunamadı; farklı bir rota planı için bu doğrulanmadı.</w:t>
+      </w:r>
+    </w:p>
     <w:p>
       <w:r>
         <w:t>Okuma: D'de toplam araç sayısı A ile aynıdır, ancak 6 minibüs yerine 3 minibüs ve ödünç sedan kullanılır. Haftalık toplam sürüş süresi çok yakındır (A: 6.450 dakika, D: 6.472 dakika); sedanlar D'deki sürüşün %14,4'ünü yapar. Yolculuk süresi sınırı gevşedikçe sedan ihtiyacı azalır ya da aynı kalır (günde en çok 4, 3, 3 ve 1 sedan; 50, 60, 70 ve 90 dakika).</w:t>
@@ -438,7 +443,7 @@
     </w:p>
     <w:p>
       <w:r>
-        <w:t>Çakışma şu demektir: sedanlar sandalyeli öğrenci taşıyamadığı için sandalyeli öğrencilerin tüm rotaları minibüslere gitmek zorundadır ve yan yana saat dilimlerinin minibüs seferleri zaman olarak üst üste biner; iki minibüs bunları sırayla yetiştiremez. Sedan sandalye taşıyabilseydi sonuçlar değişebilirdi; bu durum hesaplanmadı.</w:t>
+        <w:t>Çakışma şu demektir: sedanlar sandalyeli öğrenci taşıyamadığı için sandalyeli öğrencilerin tüm rotaları minibüslere gitmek zorundadır ve yan yana saat dilimlerinin minibüs seferleri, üretilen rota seçeneklerinin hiçbir birleşiminde iki minibüsle sırayla yetiştirilemiyor. Sedan sandalye taşıyabilseydi sonuçlar değişebilirdi; bu durum hesaplanmadı.</w:t>
       </w:r>
     </w:p>
     <w:p>
@@ -451,7 +456,7 @@
     </w:p>
     <w:p>
       <w:r>
-        <w:t>Sedan yalnızca oturan öğrenci taşır; minivan ayrıca bir sandalye de taşıyabilir. Bu yüzden sedan ancak yeterli minibüs sandalye seferlerini üstlenebiliyorsa kullanılabilir (bu hafta için en az 3 minibüs); minivan 0 minibüsle de çalışır, ama çok daha fazla araç ve saat ister. "Araç-saat", ödünç bir aracın sürüşte ve her seferden sonraki 10 dakikalık dinlenmede geçirdiği toplam süredir; aracın ödünçte kaldığı süreden kısa ya da ona eşittir.</w:t>
+        <w:t>Sedan yalnızca oturan öğrenci taşır; minivan ayrıca bir sandalye de taşıyabilir. Bu yüzden sedan ancak yeterli minibüs sandalye seferlerini üstlenebiliyorsa kullanılabilir (bu hafta için, üretilen rota seçenekleri içinde en az 3 minibüs); minivan 0 minibüsle de çalışır, ama çok daha fazla araç ve saat ister. "Araç-saat", ödünç bir aracın sürüşte ve her seferden sonraki 10 dakikalık dinlenmede geçirdiği toplam süredir; aracın ödünçte kaldığı süreden kısa ya da ona eşittir.</w:t>
       </w:r>
     </w:p>
     <w:tbl>
@@ -1006,7 +1011,7 @@
     </w:p>
     <w:p>
       <w:r>
-        <w:t>Tablodaki seçeneklerin hepsi "Pareto/elenmeyen" seçenektir: başka bir seçenek, bu üç ölçütün (minibüs sayısı, en yoğun gün ödünç araç, haftalık araç-saat) hiçbirinde daha kötü değil ve en az birinde daha iyi ise o seçenek elenir; tablodakiler elenmeyenlerdir. Karşılaştırma aynı 60 dakika sınırı içindedir.</w:t>
+        <w:t>Tablodaki seçeneklerin hepsi "Pareto/elenmeyen" seçenektir: başka bir seçenek, bu üç ölçütün (minibüs sayısı, en yoğun gün ödünç araç, haftalık araç-saat) hiçbirinde daha kötü değil ve en az birinde daha iyi ise o seçenek elenir; tablodakiler elenmeyenlerdir. Karşılaştırma aynı 60 dakika sınırı içindedir. Bu karşılaştırma yalnızca hesaplanan seçenekler arasındadır ve rotalar sezgisel üretildiği için yaklaşıktır. Çözücü her gün ödünç araç sayısını en aza indirir; araç-saat ise seçilen planın sonucudur, kendisi en aza indirilmemiştir, bu yüzden aynı araç sayısıyla farklı bir planda değişebilir.</w:t>
       </w:r>
     </w:p>
     <w:p>
@@ -1034,7 +1039,7 @@
         <w:t>3 minibüs + sedan:</w:t>
       </w:r>
       <w:r>
-        <w:t xml:space="preserve"> Pzt 2, Sal 1, Çar 3, Per 1, Cum 2 sedan. Bazı sedanlar gün boyu (ör. Pzt 07:12-16:50, Cum 07:37-17:28) elde tutulmalıdır. Araç-saatlerin %32'si saat 10:00'dan önce.</w:t>
+        <w:t xml:space="preserve"> Pzt 2, Sal 1, Çar 3, Per 1, Cum 2 sedan. Bazı sedanların, tek rota bazında ödünç alınamıyorsa gün boyu (ör. Pzt 07:12-16:50, Cum 07:37-17:28) elde tutulması gerekebilir. Araç-saatlerin %32'si saat 10:00'dan önce.</w:t>
       </w:r>
     </w:p>
     <w:p>
@@ -1076,12 +1081,12 @@
         <w:t>Melez (2 minibüs + sedan ve minivan):</w:t>
       </w:r>
       <w:r>
-        <w:t xml:space="preserve"> Sal, Per, Cum sedan; yalnızca Pzt (3 araç) ve Çar (4 araç) minivan. Haftada 44,5 araç-saat. Minivan 2 günde gerekir (saf minivanda 5 gün); ancak saf 2 minibüs + minivan seçeneği 42,5 araç-saat gerektirir, melez ise daha fazla (44,5 &gt; 42,5; 60 dakikada) gerektirir. Bu yüzden melez seçenek, 2 minibüs + minivan seçeneği tarafından elenir (en yoğun gün araç sayısı aynı, araç-saat daha fazla). Melez yalnızca minivan gün sayısını azaltır.</w:t>
+        <w:t xml:space="preserve"> günlük bazda birleştirme; aynı gün içinde karışık tür hesaplanmadı. Sal, Per, Cum sedan; yalnızca Pzt (3 araç) ve Çar (4 araç) minivan. Haftada 44,5 araç-saat. Minivan 2 günde gerekir (saf minivanda 5 gün); ancak saf 2 minibüs + minivan seçeneği 42,5 araç-saat gerektirir, melez ise daha fazla (44,5 &gt; 42,5; 60 dakikada) gerektirir. Bu yüzden melez seçenek, 2 minibüs + minivan seçeneği tarafından elenir (en yoğun gün araç sayısı aynı, araç-saat daha fazla). Melez yalnızca minivan gün sayısını azaltır.</w:t>
       </w:r>
     </w:p>
     <w:p>
       <w:r>
-        <w:t>Kullanım: Yalnızca minibüs seçeneğinde 6 minibüs günlük hizmet süresinin yaklaşık %34'ünde meşguldür; ödünç araç arttıkça kendi minibüslerimiz daha dolu çalışır (3 minibüste %58, 2'de %66, 1'de %72). Beş gün ödünç gereken seçeneklerde ödünç araçlar, ödünçte kaldıkları sürenin yaklaşık yarısında (%50-54) sürüşte ya da dinlenmededir; geri kalanı beklemedir. 4 minibüs + sedan seçeneğinde oran %100'dür.</w:t>
+        <w:t>Kullanım: Yalnızca minibüs seçeneğinde 6 minibüs günlük hizmet süresinin yaklaşık %34'ünde meşguldür; ödünç araç arttıkça kendi minibüslerimiz daha dolu çalışır (3 minibüste %58, 2'de %66, 1'de %72). Beş gün ödünç gereken seçeneklerde ödünç araçlar, ödünçte kaldıkları sürenin yaklaşık yarısında (%49,5-54) sürüşte ya da dinlenmededir; geri kalanı beklemedir. 4 minibüs + sedan seçeneğinde oran %100'dür.</w:t>
       </w:r>
     </w:p>
     <w:p>
@@ -1163,7 +1168,7 @@
         <w:pStyle w:val="ListBullet"/>
       </w:pPr>
       <w:r>
-        <w:t>Programda dersi olan her öğrencinin o gün geleceği ve tüm oturan öğrencilerin sedana ya da minivana binebileceği varsayıldı; gerçek katılım düşükse ihtiyaç azalabilir.</w:t>
+        <w:t>Programda dersi olan her öğrencinin o gün geleceği ve tüm oturan öğrencilerin sedana ya da minivana binebileceği varsayıldı; gerçek katılım düşükse ihtiyaç değişebilir.</w:t>
       </w:r>
     </w:p>
     <w:p>
@@ -1493,7 +1498,7 @@
               <w:rPr>
                 <w:sz w:val="19"/>
               </w:rPr>
-              <w:t>yapılamıyor</w:t>
+              <w:t>yapılamıyor (*)</w:t>
             </w:r>
           </w:p>
         </w:tc>
@@ -1506,7 +1511,7 @@
               <w:rPr>
                 <w:sz w:val="19"/>
               </w:rPr>
-              <w:t>yapılamıyor</w:t>
+              <w:t>yapılamıyor (*)</w:t>
             </w:r>
           </w:p>
         </w:tc>
@@ -1519,7 +1524,7 @@
               <w:rPr>
                 <w:sz w:val="19"/>
               </w:rPr>
-              <w:t>yapılamıyor</w:t>
+              <w:t>yapılamıyor (*)</w:t>
             </w:r>
           </w:p>
         </w:tc>
@@ -1532,7 +1537,7 @@
               <w:rPr>
                 <w:sz w:val="19"/>
               </w:rPr>
-              <w:t>yapılamıyor</w:t>
+              <w:t>yapılamıyor (*)</w:t>
             </w:r>
           </w:p>
         </w:tc>
@@ -1560,7 +1565,7 @@
               <w:rPr>
                 <w:sz w:val="19"/>
               </w:rPr>
-              <w:t>yapılamıyor (5 günün 2'si mümkün)</w:t>
+              <w:t>yapılamıyor (*) (5 günün 2'si mümkün)</w:t>
             </w:r>
           </w:p>
         </w:tc>
@@ -1573,7 +1578,7 @@
               <w:rPr>
                 <w:sz w:val="19"/>
               </w:rPr>
-              <w:t>yapılamıyor (3'ü mümkün)</w:t>
+              <w:t>yapılamıyor (*) (3'ü mümkün)</w:t>
             </w:r>
           </w:p>
         </w:tc>
@@ -1586,7 +1591,7 @@
               <w:rPr>
                 <w:sz w:val="19"/>
               </w:rPr>
-              <w:t>yapılamıyor (3'ü mümkün)</w:t>
+              <w:t>yapılamıyor (*) (3'ü mümkün)</w:t>
             </w:r>
           </w:p>
         </w:tc>
@@ -1599,7 +1604,7 @@
               <w:rPr>
                 <w:sz w:val="19"/>
               </w:rPr>
-              <w:t>yapılamıyor (3'ü mümkün)</w:t>
+              <w:t>yapılamıyor (*) (3'ü mümkün)</w:t>
             </w:r>
           </w:p>
         </w:tc>

</xml_diff>